<commit_message>
feat: concluir requisito 5 e implementar navegação entre requisitos
</commit_message>
<xml_diff>
--- a/public/documents/requirement5/5_2/5_2_modelo_politica.docx
+++ b/public/documents/requirement5/5_2/5_2_modelo_politica.docx
@@ -360,18 +360,16 @@
         <w:sz w:val="20"/>
         <w:szCs w:val="20"/>
       </w:rPr>
-      <w:t xml:space="preserve">MOD 5.2 – </w:t>
+      <w:t xml:space="preserve">5.2 – </w:t>
     </w:r>
-    <w:proofErr w:type="gramStart"/>
     <w:r>
       <w:rPr>
         <w:rFonts w:ascii="Cambria" w:hAnsi="Cambria"/>
         <w:sz w:val="20"/>
         <w:szCs w:val="20"/>
       </w:rPr>
-      <w:t>Politica</w:t>
+      <w:t>Política</w:t>
     </w:r>
-    <w:proofErr w:type="gramEnd"/>
     <w:r>
       <w:rPr>
         <w:rFonts w:ascii="Cambria" w:hAnsi="Cambria"/>
@@ -560,16 +558,16 @@
         <w:noProof/>
       </w:rPr>
       <w:drawing>
-        <wp:anchor distT="0" distB="0" distL="114300" distR="114300" simplePos="0" relativeHeight="251658240" behindDoc="0" locked="0" layoutInCell="1" allowOverlap="1" wp14:anchorId="6478F5B3" wp14:editId="566B54D6">
+        <wp:anchor distT="0" distB="0" distL="114300" distR="114300" simplePos="0" relativeHeight="251658240" behindDoc="0" locked="0" layoutInCell="1" allowOverlap="1" wp14:anchorId="6478F5B3" wp14:editId="2192E40D">
           <wp:simplePos x="0" y="0"/>
           <wp:positionH relativeFrom="column">
             <wp:posOffset>2135505</wp:posOffset>
           </wp:positionH>
           <wp:positionV relativeFrom="paragraph">
-            <wp:posOffset>-335280</wp:posOffset>
+            <wp:posOffset>-335279</wp:posOffset>
           </wp:positionV>
-          <wp:extent cx="1097280" cy="1043349"/>
-          <wp:effectExtent l="0" t="0" r="7620" b="4445"/>
+          <wp:extent cx="822960" cy="782512"/>
+          <wp:effectExtent l="0" t="0" r="0" b="0"/>
           <wp:wrapNone/>
           <wp:docPr id="1969381242" name="Imagem 1"/>
           <wp:cNvGraphicFramePr>
@@ -598,7 +596,7 @@
                 <pic:spPr bwMode="auto">
                   <a:xfrm>
                     <a:off x="0" y="0"/>
-                    <a:ext cx="1097280" cy="1043349"/>
+                    <a:ext cx="828005" cy="787309"/>
                   </a:xfrm>
                   <a:prstGeom prst="rect">
                     <a:avLst/>
@@ -638,11 +636,9 @@
   <w:p>
     <w:pPr>
       <w:pStyle w:val="Cabealho"/>
-    </w:pPr>
-  </w:p>
-  <w:p>
-    <w:pPr>
-      <w:pStyle w:val="Cabealho"/>
+      <w:pBdr>
+        <w:bottom w:val="single" w:sz="4" w:space="1" w:color="auto"/>
+      </w:pBdr>
       <w:jc w:val="center"/>
       <w:rPr>
         <w:rFonts w:ascii="Cambria" w:hAnsi="Cambria"/>
@@ -1269,6 +1265,7 @@
   <w:style w:type="character" w:default="1" w:styleId="Tipodeletrapredefinidodopargrafo">
     <w:name w:val="Default Paragraph Font"/>
     <w:uiPriority w:val="1"/>
+    <w:semiHidden/>
     <w:unhideWhenUsed/>
   </w:style>
   <w:style w:type="table" w:default="1" w:styleId="Tabelanormal">

</xml_diff>